<commit_message>
final touches and making a icon file
</commit_message>
<xml_diff>
--- a/docs/user-guide.docx
+++ b/docs/user-guide.docx
@@ -53,7 +53,7 @@
     <w:p>
       <w:r>
         <w:rPr/>
-        <w:t>Output is organized automatically under:</w:t>
+        <w:t>When you generate, you choose where the Generated-menu folder should be saved.</w:t>
       </w:r>
     </w:p>
     <w:p>
@@ -61,7 +61,7 @@
         <w:rPr>
           <w:rFonts w:ascii="Courier New" w:hAnsi="Courier New"/>
         </w:rPr>
-        <w:t>Generated-menu/&lt;excel_filename&gt;/&lt;event_name&gt;_English.pdf</w:t>
+        <w:t>&lt;your-selected-folder&gt;/&lt;your-selected-folder&gt;/Generated-menu/&lt;excel_filename&gt;/&lt;event_name&gt;_English.pdf</w:t>
       </w:r>
     </w:p>
     <w:p>
@@ -69,7 +69,7 @@
         <w:rPr>
           <w:rFonts w:ascii="Courier New" w:hAnsi="Courier New"/>
         </w:rPr>
-        <w:t>Generated-menu/&lt;excel_filename&gt;/&lt;event_name&gt;_Hindi.pdf</w:t>
+        <w:t>&lt;your-selected-folder&gt;/&lt;your-selected-folder&gt;/Generated-menu/&lt;excel_filename&gt;/&lt;event_name&gt;_Hindi.pdf</w:t>
       </w:r>
     </w:p>
     <w:p>
@@ -182,7 +182,7 @@
     <w:p>
       <w:r>
         <w:rPr/>
-        <w:t>Click **Generate PDF**. The app will:</w:t>
+        <w:t>Click **Generate PDF**. The app will ask you to pick a folder where the Generated-menu folder should be created. Then it will:</w:t>
       </w:r>
     </w:p>
     <w:p>
@@ -232,7 +232,7 @@
         <w:rPr>
           <w:rFonts w:ascii="Courier New" w:hAnsi="Courier New"/>
         </w:rPr>
-        <w:t>Generated-menu/&lt;excel_filename&gt;/</w:t>
+        <w:t>&lt;your-selected-folder&gt;/Generated-menu/&lt;excel_filename&gt;/</w:t>
       </w:r>
     </w:p>
     <w:p>
@@ -695,7 +695,7 @@
     <w:p>
       <w:r>
         <w:rPr/>
-        <w:t>• `count` defaults from `total_pax`, but you can change it per meal</w:t>
+        <w:t>• `count` is manual (enter per meal)</w:t>
       </w:r>
     </w:p>
     <w:p>
@@ -746,7 +746,7 @@
     <w:p>
       <w:r>
         <w:rPr/>
-        <w:t>• `total_pax` is auto-calculated from `meal_counts`</w:t>
+        <w:t>• `total_pax` is auto-calculated as the sum of all `meal_counts`</w:t>
       </w:r>
     </w:p>
     <w:p>

</xml_diff>